<commit_message>
Fix: chemin SVG voyelles_IPA corrigé (../media → media/)
os.path.dirname('Versions-html-and-docx') retournait '' ce qui
produisait un chemin relatif ../media/voyelles_IPA.svg incorrect.
Remplacé par chemin littéral 'media/voyelles_IPA.svg'.
</commit_message>
<xml_diff>
--- a/Versions-html-and-docx/section_intro_v4.docx
+++ b/Versions-html-and-docx/section_intro_v4.docx
@@ -1816,7 +1816,7 @@
                 <w:b w:val="0"/>
                 <w:sz w:val="18"/>
               </w:rPr>
-              <w:t>bouche, tour, lune</w:t>
+              <w:t>bouche, tour</w:t>
             </w:r>
           </w:p>
         </w:tc>
@@ -1908,7 +1908,7 @@
                 <w:b w:val="0"/>
                 <w:sz w:val="18"/>
               </w:rPr>
-              <w:t>beau, sol, voix</w:t>
+              <w:t>beau, veau</w:t>
             </w:r>
           </w:p>
         </w:tc>
@@ -2092,7 +2092,7 @@
                 <w:b w:val="0"/>
                 <w:sz w:val="18"/>
               </w:rPr>
-              <w:t>pas, classe, chant</w:t>
+              <w:t>pas, classe</w:t>
             </w:r>
           </w:p>
         </w:tc>
@@ -2184,7 +2184,7 @@
                 <w:b w:val="0"/>
                 <w:sz w:val="18"/>
               </w:rPr>
-              <w:t>fée, étoile, regard</w:t>
+              <w:t>fée, étoile</w:t>
             </w:r>
           </w:p>
         </w:tc>
@@ -2276,7 +2276,7 @@
                 <w:b w:val="0"/>
                 <w:sz w:val="18"/>
               </w:rPr>
-              <w:t>vie, siffler, ici</w:t>
+              <w:t>vie, siffler</w:t>
             </w:r>
           </w:p>
         </w:tc>

</xml_diff>